<commit_message>
fix(p6): apply reference-integrity fixes to JWB submission copy
Same reference repairs as the working source, applied to the active P6
submission target (jwb_package):
- add missing entries for broken in-text cites: Dickersin (1990), Dunning
  (2000), Kafouros et al. (2023), Lu & Beamish (2004), Rugman (1976), Sahay
  et al. (2020), Scott (1995), Valentine et al. (2010), Vernon (1971)
- fix 'Perryy, M. Z.' -> 'Perryman, A. A.' (Kirca et al. 2012)
- replace wrong Wu (2022, JWB, impossible vol. 52) entry with cited
  meta-analysis Wu, Wood & Khan (2022, IBR)
- align in-text 'Kafouros et al., 2012' -> 2023; reorder Stallkamp before Stanley

Numbers left untouched pending author reconciliation (see review report):
the JWB copy's detailed publication-bias/subgroup statistics differ from the
working source and neither reproduces from the headline-only verify script.
</commit_message>
<xml_diff>
--- a/p6/submission/jwb_package/01_manuscript_blinded.docx
+++ b/p6/submission/jwb_package/01_manuscript_blinded.docx
@@ -2,7 +2,7 @@
 <file path=word/document.xml><?xml version="1.0" encoding="utf-8"?>
 <w:document xmlns:w="http://schemas.openxmlformats.org/wordprocessingml/2006/main" xmlns:m="http://schemas.openxmlformats.org/officeDocument/2006/math" xmlns:r="http://schemas.openxmlformats.org/officeDocument/2006/relationships" xmlns:o="urn:schemas-microsoft-com:office:office" xmlns:v="urn:schemas-microsoft-com:vml" xmlns:w10="urn:schemas-microsoft-com:office:word" xmlns:a="http://schemas.openxmlformats.org/drawingml/2006/main" xmlns:pic="http://schemas.openxmlformats.org/drawingml/2006/picture" xmlns:wp="http://schemas.openxmlformats.org/drawingml/2006/wordprocessingDrawing">
   <w:body>
-    <w:bookmarkStart w:id="65" w:name="X0c6e4d0da10b64d0e26e4f46cdf4d61de6495dd"/>
+    <w:bookmarkStart w:id="67" w:name="X0c6e4d0da10b64d0e26e4f46cdf4d61de6495dd"/>
     <w:p>
       <w:pPr>
         <w:pStyle w:val="Heading1"/>
@@ -758,7 +758,7 @@
         <w:t xml:space="preserve"> </w:t>
       </w:r>
       <w:r>
-        <w:t xml:space="preserve">Kafouros et al., 2012). Against this backdrop, the question of whether</w:t>
+        <w:t xml:space="preserve">Kafouros et al., 2023). Against this backdrop, the question of whether</w:t>
       </w:r>
       <w:r>
         <w:t xml:space="preserve"> </w:t>
@@ -17749,7 +17749,7 @@
       </w:r>
     </w:p>
     <w:bookmarkEnd w:id="57"/>
-    <w:bookmarkStart w:id="61" w:name="references"/>
+    <w:bookmarkStart w:id="63" w:name="references"/>
     <w:p>
       <w:pPr>
         <w:pStyle w:val="Heading2"/>
@@ -18192,6 +18192,27 @@
       </w:r>
       <w:r>
         <w:t xml:space="preserve">(2), 355–361.</w:t>
+      </w:r>
+    </w:p>
+    <w:p>
+      <w:pPr>
+        <w:pStyle w:val="BodyText"/>
+      </w:pPr>
+      <w:r>
+        <w:t xml:space="preserve">Dickersin, K. (1990). The existence of publication bias and risk factors for its occurrence.</w:t>
+      </w:r>
+      <w:r>
+        <w:t xml:space="preserve"> </w:t>
+      </w:r>
+      <w:r>
+        <w:rPr>
+          <w:iCs/>
+          <w:i/>
+        </w:rPr>
+        <w:t xml:space="preserve">JAMA, 263</w:t>
+      </w:r>
+      <w:r>
+        <w:t xml:space="preserve">(10), 1385–1389.</w:t>
       </w:r>
     </w:p>
     <w:p>
@@ -18307,6 +18328,27 @@
         <w:pStyle w:val="BodyText"/>
       </w:pPr>
       <w:r>
+        <w:t xml:space="preserve">Dunning, J. H. (2000). The eclectic paradigm as an envelope for economic and business theories of MNE activity.</w:t>
+      </w:r>
+      <w:r>
+        <w:t xml:space="preserve"> </w:t>
+      </w:r>
+      <w:r>
+        <w:rPr>
+          <w:iCs/>
+          <w:i/>
+        </w:rPr>
+        <w:t xml:space="preserve">International Business Review, 9</w:t>
+      </w:r>
+      <w:r>
+        <w:t xml:space="preserve">(1), 163–190.</w:t>
+      </w:r>
+    </w:p>
+    <w:p>
+      <w:pPr>
+        <w:pStyle w:val="BodyText"/>
+      </w:pPr>
+      <w:r>
         <w:t xml:space="preserve">Duval, S., &amp; Tweedie, R. (2000). Trim and fill: A simple</w:t>
       </w:r>
       <w:r>
@@ -18515,6 +18557,38 @@
         <w:pStyle w:val="BodyText"/>
       </w:pPr>
       <w:r>
+        <w:t xml:space="preserve">Kafouros, M., Aliyev, M., Piperopoulos, P., Au, A. K. M., Ho, J. W. Y., &amp; Wong, S. Y. N. (2023). The role of institutional quality and industry dynamism in explaining firm performance in emerging economies.</w:t>
+      </w:r>
+      <w:r>
+        <w:t xml:space="preserve"> </w:t>
+      </w:r>
+      <w:r>
+        <w:rPr>
+          <w:iCs/>
+          <w:i/>
+        </w:rPr>
+        <w:t xml:space="preserve">Global Strategy Journal, 14</w:t>
+      </w:r>
+      <w:r>
+        <w:t xml:space="preserve">(1), 56–83.</w:t>
+      </w:r>
+      <w:r>
+        <w:t xml:space="preserve"> </w:t>
+      </w:r>
+      <w:hyperlink r:id="rId59">
+        <w:r>
+          <w:rPr>
+            <w:rStyle w:val="Hyperlink"/>
+          </w:rPr>
+          <w:t xml:space="preserve">https://doi.org/10.1002/gsj.1479</w:t>
+        </w:r>
+      </w:hyperlink>
+    </w:p>
+    <w:p>
+      <w:pPr>
+        <w:pStyle w:val="BodyText"/>
+      </w:pPr>
+      <w:r>
         <w:t xml:space="preserve">Katz, R., &amp; Callorda, F. (2018).</w:t>
       </w:r>
       <w:r>
@@ -18591,7 +18665,7 @@
         <w:pStyle w:val="BodyText"/>
       </w:pPr>
       <w:r>
-        <w:t xml:space="preserve">Kirca, A. H., Hult, G. T. M., Deligonul, S., Perryy, M. Z., &amp; Cavusgil,</w:t>
+        <w:t xml:space="preserve">Kirca, A. H., Hult, G. T. M., Deligonul, S., Perryman, A. A., &amp; Cavusgil,</w:t>
       </w:r>
       <w:r>
         <w:t xml:space="preserve"> </w:t>
@@ -18749,6 +18823,38 @@
         <w:pStyle w:val="BodyText"/>
       </w:pPr>
       <w:r>
+        <w:t xml:space="preserve">Lu, J. W., &amp; Beamish, P. W. (2004). International diversification and firm performance: The S-curve hypothesis.</w:t>
+      </w:r>
+      <w:r>
+        <w:t xml:space="preserve"> </w:t>
+      </w:r>
+      <w:r>
+        <w:rPr>
+          <w:iCs/>
+          <w:i/>
+        </w:rPr>
+        <w:t xml:space="preserve">Academy of Management Journal, 47</w:t>
+      </w:r>
+      <w:r>
+        <w:t xml:space="preserve">(4), 598–609.</w:t>
+      </w:r>
+      <w:r>
+        <w:t xml:space="preserve"> </w:t>
+      </w:r>
+      <w:hyperlink r:id="rId60">
+        <w:r>
+          <w:rPr>
+            <w:rStyle w:val="Hyperlink"/>
+          </w:rPr>
+          <w:t xml:space="preserve">https://doi.org/10.2307/20159604</w:t>
+        </w:r>
+      </w:hyperlink>
+    </w:p>
+    <w:p>
+      <w:pPr>
+        <w:pStyle w:val="BodyText"/>
+      </w:pPr>
+      <w:r>
         <w:t xml:space="preserve">Marano, V., Arregle, J.-L., Hitt, M. A., Spadafora, E., &amp; van Essen, M.</w:t>
       </w:r>
       <w:r>
@@ -18886,7 +18992,7 @@
       <w:r>
         <w:t xml:space="preserve"> </w:t>
       </w:r>
-      <w:hyperlink r:id="rId59">
+      <w:hyperlink r:id="rId61">
         <w:r>
           <w:rPr>
             <w:rStyle w:val="Hyperlink"/>
@@ -19052,6 +19158,51 @@
         <w:pStyle w:val="BodyText"/>
       </w:pPr>
       <w:r>
+        <w:t xml:space="preserve">Rugman, A. M. (1976). Risk reduction by international diversification.</w:t>
+      </w:r>
+      <w:r>
+        <w:t xml:space="preserve"> </w:t>
+      </w:r>
+      <w:r>
+        <w:rPr>
+          <w:iCs/>
+          <w:i/>
+        </w:rPr>
+        <w:t xml:space="preserve">Journal of International Business Studies, 7</w:t>
+      </w:r>
+      <w:r>
+        <w:t xml:space="preserve">(2), 75–80.</w:t>
+      </w:r>
+    </w:p>
+    <w:p>
+      <w:pPr>
+        <w:pStyle w:val="BodyText"/>
+      </w:pPr>
+      <w:r>
+        <w:t xml:space="preserve">Sahay, R., von Allmen, U. E., Lahreche, A., Khera, P., Ogawa, S., Bazarbash, M., &amp; Beaton, K. (2020).</w:t>
+      </w:r>
+      <w:r>
+        <w:t xml:space="preserve"> </w:t>
+      </w:r>
+      <w:r>
+        <w:rPr>
+          <w:iCs/>
+          <w:i/>
+        </w:rPr>
+        <w:t xml:space="preserve">The promise of fintech: Financial inclusion in the post COVID-19 era</w:t>
+      </w:r>
+      <w:r>
+        <w:t xml:space="preserve"> </w:t>
+      </w:r>
+      <w:r>
+        <w:t xml:space="preserve">(IMF Departmental Paper No. DP/2020/09). International Monetary Fund.</w:t>
+      </w:r>
+    </w:p>
+    <w:p>
+      <w:pPr>
+        <w:pStyle w:val="BodyText"/>
+      </w:pPr>
+      <w:r>
         <w:t xml:space="preserve">Schwens, C., Zapkau, F. B., Brouthers, K. D., &amp; Hollender, L. (2018).</w:t>
       </w:r>
       <w:r>
@@ -19079,6 +19230,68 @@
         <w:pStyle w:val="BodyText"/>
       </w:pPr>
       <w:r>
+        <w:t xml:space="preserve">Scott, W. R. (1995).</w:t>
+      </w:r>
+      <w:r>
+        <w:t xml:space="preserve"> </w:t>
+      </w:r>
+      <w:r>
+        <w:rPr>
+          <w:iCs/>
+          <w:i/>
+        </w:rPr>
+        <w:t xml:space="preserve">Institutions and organizations</w:t>
+      </w:r>
+      <w:r>
+        <w:t xml:space="preserve">. Sage.</w:t>
+      </w:r>
+    </w:p>
+    <w:p>
+      <w:pPr>
+        <w:pStyle w:val="BodyText"/>
+      </w:pPr>
+      <w:r>
+        <w:t xml:space="preserve">Stallkamp, M., &amp; Schotter, A. P. J. (2021). Platforms without borders?</w:t>
+      </w:r>
+      <w:r>
+        <w:t xml:space="preserve"> </w:t>
+      </w:r>
+      <w:r>
+        <w:t xml:space="preserve">The international strategies of digital platform firms.</w:t>
+      </w:r>
+      <w:r>
+        <w:t xml:space="preserve"> </w:t>
+      </w:r>
+      <w:r>
+        <w:rPr>
+          <w:iCs/>
+          <w:i/>
+        </w:rPr>
+        <w:t xml:space="preserve">Global Strategy</w:t>
+      </w:r>
+      <w:r>
+        <w:rPr>
+          <w:iCs/>
+          <w:i/>
+        </w:rPr>
+        <w:t xml:space="preserve"> </w:t>
+      </w:r>
+      <w:r>
+        <w:rPr>
+          <w:iCs/>
+          <w:i/>
+        </w:rPr>
+        <w:t xml:space="preserve">Journal, 11</w:t>
+      </w:r>
+      <w:r>
+        <w:t xml:space="preserve">(1), 58–80.</w:t>
+      </w:r>
+    </w:p>
+    <w:p>
+      <w:pPr>
+        <w:pStyle w:val="BodyText"/>
+      </w:pPr>
+      <w:r>
         <w:t xml:space="preserve">Stanley, T. D., &amp; Doucouliagos, H. (2014). Meta-regression</w:t>
       </w:r>
       <w:r>
@@ -19120,40 +19333,26 @@
         <w:pStyle w:val="BodyText"/>
       </w:pPr>
       <w:r>
-        <w:t xml:space="preserve">Stallkamp, M., &amp; Schotter, A. P. J. (2021). Platforms without borders?</w:t>
-      </w:r>
-      <w:r>
-        <w:t xml:space="preserve"> </w:t>
-      </w:r>
-      <w:r>
-        <w:t xml:space="preserve">The international strategies of digital platform firms.</w:t>
-      </w:r>
-      <w:r>
-        <w:t xml:space="preserve"> </w:t>
-      </w:r>
-      <w:r>
-        <w:rPr>
-          <w:iCs/>
-          <w:i/>
-        </w:rPr>
-        <w:t xml:space="preserve">Global Strategy</w:t>
-      </w:r>
-      <w:r>
-        <w:rPr>
-          <w:iCs/>
-          <w:i/>
-        </w:rPr>
-        <w:t xml:space="preserve"> </w:t>
-      </w:r>
-      <w:r>
-        <w:rPr>
-          <w:iCs/>
-          <w:i/>
-        </w:rPr>
-        <w:t xml:space="preserve">Journal, 11</w:t>
-      </w:r>
-      <w:r>
-        <w:t xml:space="preserve">(1), 58–80.</w:t>
+        <w:t xml:space="preserve">Sutton, A. J., &amp; Higgins, J. P. T. (2008). Recent developments in</w:t>
+      </w:r>
+      <w:r>
+        <w:t xml:space="preserve"> </w:t>
+      </w:r>
+      <w:r>
+        <w:t xml:space="preserve">meta-analysis.</w:t>
+      </w:r>
+      <w:r>
+        <w:t xml:space="preserve"> </w:t>
+      </w:r>
+      <w:r>
+        <w:rPr>
+          <w:iCs/>
+          <w:i/>
+        </w:rPr>
+        <w:t xml:space="preserve">Statistics in Medicine, 27</w:t>
+      </w:r>
+      <w:r>
+        <w:t xml:space="preserve">(5), 625–650.</w:t>
       </w:r>
     </w:p>
     <w:p>
@@ -19161,26 +19360,20 @@
         <w:pStyle w:val="BodyText"/>
       </w:pPr>
       <w:r>
-        <w:t xml:space="preserve">Sutton, A. J., &amp; Higgins, J. P. T. (2008). Recent developments in</w:t>
-      </w:r>
-      <w:r>
-        <w:t xml:space="preserve"> </w:t>
-      </w:r>
-      <w:r>
-        <w:t xml:space="preserve">meta-analysis.</w:t>
-      </w:r>
-      <w:r>
-        <w:t xml:space="preserve"> </w:t>
-      </w:r>
-      <w:r>
-        <w:rPr>
-          <w:iCs/>
-          <w:i/>
-        </w:rPr>
-        <w:t xml:space="preserve">Statistics in Medicine, 27</w:t>
-      </w:r>
-      <w:r>
-        <w:t xml:space="preserve">(5), 625–650.</w:t>
+        <w:t xml:space="preserve">Valentine, J. C., Pigott, T. D., &amp; Rothstein, H. R. (2010). How many studies do you need? A primer on statistical power for meta-analysis.</w:t>
+      </w:r>
+      <w:r>
+        <w:t xml:space="preserve"> </w:t>
+      </w:r>
+      <w:r>
+        <w:rPr>
+          <w:iCs/>
+          <w:i/>
+        </w:rPr>
+        <w:t xml:space="preserve">Journal of Educational and Behavioral Statistics, 35</w:t>
+      </w:r>
+      <w:r>
+        <w:t xml:space="preserve">(2), 215–247.</w:t>
       </w:r>
     </w:p>
     <w:p>
@@ -19268,6 +19461,27 @@
         <w:pStyle w:val="BodyText"/>
       </w:pPr>
       <w:r>
+        <w:t xml:space="preserve">Vernon, R. (1971).</w:t>
+      </w:r>
+      <w:r>
+        <w:t xml:space="preserve"> </w:t>
+      </w:r>
+      <w:r>
+        <w:rPr>
+          <w:iCs/>
+          <w:i/>
+        </w:rPr>
+        <w:t xml:space="preserve">Sovereignty at bay: The multinational spread of U.S. enterprises</w:t>
+      </w:r>
+      <w:r>
+        <w:t xml:space="preserve">. Basic Books.</w:t>
+      </w:r>
+    </w:p>
+    <w:p>
+      <w:pPr>
+        <w:pStyle w:val="BodyText"/>
+      </w:pPr>
+      <w:r>
         <w:t xml:space="preserve">Vevea, J. L., &amp; Woods, C. M. (2005). Publication bias in research</w:t>
       </w:r>
       <w:r>
@@ -19375,7 +19589,7 @@
       <w:r>
         <w:t xml:space="preserve"> </w:t>
       </w:r>
-      <w:hyperlink r:id="rId60">
+      <w:hyperlink r:id="rId62">
         <w:r>
           <w:rPr>
             <w:rStyle w:val="Hyperlink"/>
@@ -19389,32 +19603,20 @@
         <w:pStyle w:val="BodyText"/>
       </w:pPr>
       <w:r>
-        <w:t xml:space="preserve">Wu, J., Wang, C., Hong, J., Piperopoulos, P., &amp; Zhuo, S. (2022).</w:t>
-      </w:r>
-      <w:r>
-        <w:t xml:space="preserve"> </w:t>
-      </w:r>
-      <w:r>
-        <w:t xml:space="preserve">Internationalization and innovation performance of emerging market</w:t>
-      </w:r>
-      <w:r>
-        <w:t xml:space="preserve"> </w:t>
-      </w:r>
-      <w:r>
-        <w:t xml:space="preserve">enterprises: The role of host-country institutional development.</w:t>
-      </w:r>
-      <w:r>
-        <w:t xml:space="preserve"> </w:t>
-      </w:r>
-      <w:r>
-        <w:rPr>
-          <w:iCs/>
-          <w:i/>
-        </w:rPr>
-        <w:t xml:space="preserve">Journal of World Business, 52</w:t>
-      </w:r>
-      <w:r>
-        <w:t xml:space="preserve">(2), 192–203.</w:t>
+        <w:t xml:space="preserve">Wu, J., Wood, G., &amp; Khan, Z. (2022). Internationalization and firm performance: Evidence from a meta-analysis.</w:t>
+      </w:r>
+      <w:r>
+        <w:t xml:space="preserve"> </w:t>
+      </w:r>
+      <w:r>
+        <w:rPr>
+          <w:iCs/>
+          <w:i/>
+        </w:rPr>
+        <w:t xml:space="preserve">International Business Review, 31</w:t>
+      </w:r>
+      <w:r>
+        <w:t xml:space="preserve">(2), 101920.</w:t>
       </w:r>
     </w:p>
     <w:p>
@@ -19452,8 +19654,8 @@
         <w:t xml:space="preserve">(2), 341–363.</w:t>
       </w:r>
     </w:p>
-    <w:bookmarkEnd w:id="61"/>
-    <w:bookmarkStart w:id="62" w:name="X6e5cfb15c9bb56aea620267700f1f842431a0be"/>
+    <w:bookmarkEnd w:id="63"/>
+    <w:bookmarkStart w:id="64" w:name="X6e5cfb15c9bb56aea620267700f1f842431a0be"/>
     <w:p>
       <w:pPr>
         <w:pStyle w:val="Heading2"/>
@@ -19687,8 +19889,8 @@
         <w:t xml:space="preserve">The PRISMA 2020 checklist (Page et al., 2021) is available from the corresponding author.</w:t>
       </w:r>
     </w:p>
-    <w:bookmarkEnd w:id="62"/>
-    <w:bookmarkStart w:id="63" w:name="appendix-b-coding-protocol-7-moderators"/>
+    <w:bookmarkEnd w:id="64"/>
+    <w:bookmarkStart w:id="65" w:name="appendix-b-coding-protocol-7-moderators"/>
     <w:p>
       <w:pPr>
         <w:pStyle w:val="Heading2"/>
@@ -20017,8 +20219,8 @@
         </w:tc>
       </w:tr>
     </w:tbl>
-    <w:bookmarkEnd w:id="63"/>
-    <w:bookmarkStart w:id="64" w:name="Xd9634948d23722ae653a4402a0c9331cc7088ab"/>
+    <w:bookmarkEnd w:id="65"/>
+    <w:bookmarkStart w:id="66" w:name="Xd9634948d23722ae653a4402a0c9331cc7088ab"/>
     <w:p>
       <w:pPr>
         <w:pStyle w:val="Heading2"/>
@@ -20597,8 +20799,8 @@
         <w:t xml:space="preserve">Word count (excluding tables, references, appendices): ≈ 6,900 words</w:t>
       </w:r>
     </w:p>
-    <w:bookmarkEnd w:id="64"/>
-    <w:bookmarkEnd w:id="65"/>
+    <w:bookmarkEnd w:id="66"/>
+    <w:bookmarkEnd w:id="67"/>
     <w:sectPr>
       <w:pgSz w:h="16838" w:w="11906"/>
       <w:pgMar w:bottom="1417" w:left="1417" w:right="1417" w:top="1417"/>

</xml_diff>